<commit_message>
Refocus stage-two agenda on survey-driven operating questions.
Recast the five management topics around core competitiveness, win rate,
execution efficiency, large-project collaboration, and cross-department synergy.

Co-authored-by: liborvybral-collab <liborvybral-collab@users.noreply.github.com>
</commit_message>
<xml_diff>
--- a/docs/reports/surveys/2026-fy-internal-management/第二阶段经营关键议题.docx
+++ b/docs/reports/surveys/2026-fy-internal-management/第二阶段经营关键议题.docx
@@ -12,14 +12,11 @@
     </w:p>
     <w:p>
       <w:r>
-        <w:t>阶段定位： 内部调研已完成。本阶段由管理层围绕经营层面关键议题专题讨论，明确下半年经营策略方向与重点工作。</w:t>
+        <w:t>阶段定位： 内部调研已完成。本阶段议题直接聚焦调研中员工集中提出的经营问题，由管理层专题讨论，形成下半年可执行方向。</w:t>
       </w:r>
     </w:p>
     <w:p>
       <w:r>
-        <w:rPr>
-          <w:b/>
-        </w:rPr>
         <w:t>议题原则：</w:t>
       </w:r>
     </w:p>
@@ -28,7 +25,7 @@
         <w:pStyle w:val="ListBullet"/>
       </w:pPr>
       <w:r>
-        <w:t>只议**公司经营层面**事项（战略、打单、交付、增长、能力），不把日常行政细则升格为经营议题。</w:t>
+        <w:t>议题表述对齐调研原题与高频痛点，不另起一套“空战略话术”。</w:t>
       </w:r>
     </w:p>
     <w:p>
@@ -36,7 +33,7 @@
         <w:pStyle w:val="ListBullet"/>
       </w:pPr>
       <w:r>
-        <w:t>数量控制在 **5 个以内**，每个议题必须能当场形成：方向判断 + 责任部门 + 下半年动作。</w:t>
+        <w:t>数量控制在 **5 个以内**；每个议题当场形成：方向判断 + 责任部门 + 下半年动作。</w:t>
       </w:r>
     </w:p>
     <w:p>
@@ -44,7 +41,7 @@
         <w:pStyle w:val="ListBullet"/>
       </w:pPr>
       <w:r>
-        <w:t>员工体验类诉求（双休/考勤/报销等）建议另作“组织回应专题”，不占用本阶段经营议题名额；但会前需明确是否同步通报调研回应口径。</w:t>
+        <w:t>双休/考勤/报销等员工体验问题另作组织回应，不占本阶段经营五题。</w:t>
       </w:r>
     </w:p>
     <w:p>
@@ -57,37 +54,37 @@
         <w:pStyle w:val="Heading1"/>
       </w:pPr>
       <w:r>
-        <w:t>建议确定的 5 个关键议题</w:t>
+        <w:t>建议确定的 5 个关键议题（对齐调研）</w:t>
       </w:r>
     </w:p>
     <w:p>
       <w:r>
-        <w:t>序  |  经营议题  |  一句话要解决的问题  |  调研依据（信号）  |  会上须拍板</w:t>
+        <w:t>| 序 | 关键议题（讨论命题） | 对应调研题 | 调研核心信号 | 会上须拍板 |</w:t>
       </w:r>
     </w:p>
     <w:p>
       <w:r>
-        <w:t>1  |  **靠什么赢、做什么与不做什么**  |  竞争力口径与主航道是否收口  |  聚焦赛道 40%；EPC/系统交付 28%；“什么都能做都不精”焦虑强  |  一句话竞争力；主航道 2–3 个；负面清单；第二曲线只选 1 条</w:t>
+        <w:t>| 1 | **如何塑造公司核心竞争力？** | Q3 核心竞争力；兼及 Q2 赛道 | EPC/系统交付、行业深度、履约口碑、技术差异化说法多但不统一；缺拳头产品焦虑 | 一句话竞争力定义；今明两年各建什么；对外禁止空喊的口径 |</w:t>
       </w:r>
     </w:p>
     <w:p>
       <w:r>
-        <w:t>2  |  **如何提高成单率**  |  线索筛不筛、资源如何配  |  线索分级与成单率 34%；询盘多、无效方案耗技术  |  三级分类强制规则；提资前置可否退回；分档报价是否试点</w:t>
+        <w:t>| 2 | **怎么提升项目打单成功率？** | Q4 项目打单 | 询盘多成单低；线索分级不足；提资不清耗技术；报价一刀切 | 三级分类与响应规则；提资前置可否退回；分档报价与丢单复盘是否强制 |</w:t>
       </w:r>
     </w:p>
     <w:p>
       <w:r>
-        <w:t>3  |  **如何稳交付、保口碑**  |  执行链总控有没有牙齿  |  供应商/质检 36%；设计—采购—质检—发货—现场断链  |  计划运营总控权责；质量闸门；产能触顶规则；复盘强制</w:t>
+        <w:t>| 3 | **怎么提升项目执行效率与交付质量？** | Q5 项目执行 | 深化—采购—质检—发货—现场断链；供应商/质检 36%；赶工返工损口碑 | 计划运营总控权责；质量闸门；产能触顶规则；交底/变更/复盘强制动作 |</w:t>
       </w:r>
     </w:p>
     <w:p>
       <w:r>
-        <w:t>4  |  **下半年增长抓手是什么**  |  增量从哪来、投入上限多少  |  第二增长（改造/运维等）22%；品牌案例/展会获客高频；公海浪费  |  选定 1 个增长抓手（如旧仓改造运维 / 重点市场精耕）；投入与退出标准</w:t>
+        <w:t>| 4 | **如何做好大项目协作？** | Q4+Q5 交叉；铁三角/重点项目 | 重点项目资源吃不饱、一般项目拖骨干；业务—技术—成本—工程接口乱 | 大项目定义标准；铁三角/专班机制；例会、提资、变更、现场授权规则 |</w:t>
       </w:r>
     </w:p>
     <w:p>
       <w:r>
-        <w:t>5  |  **经营提效抓哪两件事**  |  数字化与组织接口先打哪  |  数字化/信息化 41%；跨部门协同 45%；AI 场景建议具体  |  定 2 件：①AI/知识库试点范围；②先打通的 2–3 条跨部门关键接口</w:t>
+        <w:t>| 5 | **如何提升跨部门协同效率？** | 跨题高频（协同 45%）；Q8 | 信息差、推诿、会议低效、权责不清；个人驱动→体系驱动转不过来 | 下半年先打通的 2–3 条关键接口；权责时限；考核是否挂钩 |</w:t>
       </w:r>
     </w:p>
     <w:p>
@@ -108,20 +105,17 @@
         <w:pStyle w:val="Heading2"/>
       </w:pPr>
       <w:r>
-        <w:t>议题 1：靠什么赢、做什么与不做什么</w:t>
+        <w:t>议题 1：如何塑造公司核心竞争力？</w:t>
       </w:r>
     </w:p>
     <w:p>
       <w:r>
-        <w:t>经营本质： 先定“我们是谁、战场在哪”，再谈打单与交付，否则各部门口径与资源投放会持续打架。</w:t>
+        <w:t>调研在问什么： 应如何构建公司的核心竞争力？产品与赛道如何定位？</w:t>
       </w:r>
     </w:p>
     <w:p>
       <w:r>
-        <w:rPr>
-          <w:b/>
-        </w:rPr>
-        <w:t>建议讨论：</w:t>
+        <w:t>员工共识画像（组合竞争力，而非单一产品）：</w:t>
       </w:r>
     </w:p>
     <w:p>
@@ -129,7 +123,7 @@
         <w:pStyle w:val="ListBullet"/>
       </w:pPr>
       <w:r>
-        <w:t>竞争力主表述选一为主（如：大宗散料智慧储运 EPC 系统交付 / 重点行业工艺深度 / 履约口碑 / 技术差异化 / 供应链掌控），另至多两项作支撑。</w:t>
+        <w:t>大宗散料智慧储运 **EPC / 系统交付**能力</w:t>
       </w:r>
     </w:p>
     <w:p>
@@ -137,7 +131,7 @@
         <w:pStyle w:val="ListBullet"/>
       </w:pPr>
       <w:r>
-        <w:t>主航道从水泥建材、粮食、港口、矿产/能源中定 **2–3 个**；写清机会型与**不做什么**。</w:t>
+        <w:t>重点行业**工艺与场景深度**（水泥、粮食、港口、矿产等）</w:t>
       </w:r>
     </w:p>
     <w:p>
@@ -145,12 +139,53 @@
         <w:pStyle w:val="ListBullet"/>
       </w:pPr>
       <w:r>
-        <w:t>第二曲线只验证 **1 条**（优先旧仓改造+运维，或工业散料延伸），设投入上限与退出标准。</w:t>
+        <w:t>**履约与交付口碑**（海外圈子小，口碑即获客）</w:t>
+      </w:r>
+    </w:p>
+    <w:p>
+      <w:pPr>
+        <w:pStyle w:val="ListBullet"/>
+      </w:pPr>
+      <w:r>
+        <w:t>**技术研发与差异化**（智能监测、特殊物料等可售卖能力）</w:t>
+      </w:r>
+    </w:p>
+    <w:p>
+      <w:pPr>
+        <w:pStyle w:val="ListBullet"/>
+      </w:pPr>
+      <w:r>
+        <w:t>人才与组织能力</w:t>
       </w:r>
     </w:p>
     <w:p>
       <w:r>
-        <w:t>会后产物： 《竞争力定义卡》+《下半年主航道与负面清单一页纸》</w:t>
+        <w:t>尖锐信号： 无拳头产品、参观无样品、过度依赖价格与关系；“什么都能做、什么都不精”。</w:t>
+      </w:r>
+    </w:p>
+    <w:p>
+      <w:r>
+        <w:t>会上请拍板：</w:t>
+      </w:r>
+    </w:p>
+    <w:p>
+      <w:r>
+        <w:t>1. 一句话竞争力定义（≤40 字），业务/技术/工程/品牌能共同对外说。</w:t>
+      </w:r>
+    </w:p>
+    <w:p>
+      <w:r>
+        <w:t>2. 哪些是“现在就能赢单的”，哪些是“明年要建成的”。</w:t>
+      </w:r>
+    </w:p>
+    <w:p>
+      <w:r>
+        <w:t>3. 主航道定 2–3 个行业；明确 1–3 条负面清单（不做什么）；第二曲线只选 1 条验证。</w:t>
+      </w:r>
+    </w:p>
+    <w:p>
+      <w:r>
+        <w:t>会后产物： 《核心竞争力定义卡》+《主航道与负面清单一页纸》</w:t>
       </w:r>
     </w:p>
     <w:p>
@@ -163,20 +198,17 @@
         <w:pStyle w:val="Heading2"/>
       </w:pPr>
       <w:r>
-        <w:t>议题 2：如何提高成单率</w:t>
+        <w:t>议题 2：怎么提升项目打单成功率？</w:t>
       </w:r>
     </w:p>
     <w:p>
       <w:r>
-        <w:t>经营本质： 前端不是缺线索，而是缺筛选与深度投入的标准；成单率上不去，技术与成本资源会被低质询盘拖死。</w:t>
+        <w:t>调研在问什么： 线索分配、客户开发、方案设计、项目报价等，现状问题与可落地方案。</w:t>
       </w:r>
     </w:p>
     <w:p>
       <w:r>
-        <w:rPr>
-          <w:b/>
-        </w:rPr>
-        <w:t>建议讨论：</w:t>
+        <w:t>问题画像：</w:t>
       </w:r>
     </w:p>
     <w:p>
@@ -184,7 +216,7 @@
         <w:pStyle w:val="ListBullet"/>
       </w:pPr>
       <w:r>
-        <w:t>线索/项目三级（战略/重点/一般）：每级响应深度、时限、谁拍板。</w:t>
+        <w:t>询盘多、有效商机少；比价型线索消耗技术资源</w:t>
       </w:r>
     </w:p>
     <w:p>
@@ -192,7 +224,7 @@
         <w:pStyle w:val="ListBullet"/>
       </w:pPr>
       <w:r>
-        <w:t>提资前置清单（物料、流程、范围、品牌、决策人等）未齐备可否退回。</w:t>
+        <w:t>跟进不彻底、渠道单一、公海与线索闭环弱</w:t>
       </w:r>
     </w:p>
     <w:p>
@@ -200,7 +232,7 @@
         <w:pStyle w:val="ListBullet"/>
       </w:pPr>
       <w:r>
-        <w:t>一般线索标准化快响；重点项目铁三角吃饱资源。</w:t>
+        <w:t>需求未澄清就提技术任务；方案时间被挤、质量不稳</w:t>
       </w:r>
     </w:p>
     <w:p>
@@ -208,12 +240,37 @@
         <w:pStyle w:val="ListBullet"/>
       </w:pPr>
       <w:r>
-        <w:t>报价高/中/低分档是否试点；成单/丢单是否进入月度经营会固定复盘。</w:t>
+        <w:t>报价偏高或一刀切，缺少分档与竞对复盘</w:t>
       </w:r>
     </w:p>
     <w:p>
       <w:r>
-        <w:t>会后产物： 《项目筛选与响应规则》及上线时间（业务 + 技术 + 计划运营 + 总经办）</w:t>
+        <w:t>会上请拍板：</w:t>
+      </w:r>
+    </w:p>
+    <w:p>
+      <w:r>
+        <w:t>1. 线索/项目三级（战略/重点/一般）是否强制执行，每级响应深度与时限。</w:t>
+      </w:r>
+    </w:p>
+    <w:p>
+      <w:r>
+        <w:t>2. 提资前置清单未齐备，技术可否退回。</w:t>
+      </w:r>
+    </w:p>
+    <w:p>
+      <w:r>
+        <w:t>3. 一般线索标准化快响 vs 重点项目吃饱资源。</w:t>
+      </w:r>
+    </w:p>
+    <w:p>
+      <w:r>
+        <w:t>4. 高/中/低分档报价是否试点；成单/丢单是否进入月度经营会固定复盘。</w:t>
+      </w:r>
+    </w:p>
+    <w:p>
+      <w:r>
+        <w:t>会后产物： 《项目筛选与打单响应规则》及上线时间（业务 + 技术 + 成本招采 + 计划运营）</w:t>
       </w:r>
     </w:p>
     <w:p>
@@ -226,60 +283,52 @@
         <w:pStyle w:val="Heading2"/>
       </w:pPr>
       <w:r>
-        <w:t>议题 3：如何稳交付、保口碑</w:t>
+        <w:t>议题 3：怎么提升项目执行效率与交付质量？</w:t>
       </w:r>
     </w:p>
     <w:p>
       <w:r>
-        <w:t>经营本质： 海外圈子小，交付口碑即获客；执行断链会直接吃掉前端辛苦拿下的订单利润与信誉。</w:t>
+        <w:t>调研在问什么： 深化设计、物资采购、质检、发货、工程施工等，影响交付效率与质量的实际问题。</w:t>
       </w:r>
     </w:p>
     <w:p>
       <w:r>
-        <w:rPr>
-          <w:b/>
-        </w:rPr>
-        <w:t>建议讨论：</w:t>
+        <w:t>问题链条（高度一致）：</w:t>
       </w:r>
     </w:p>
     <w:p>
-      <w:pPr>
-        <w:pStyle w:val="ListBullet"/>
-      </w:pPr>
       <w:r>
-        <w:t>计划运营是否具备对技术/采购/质检/物流/工程的节点约束与考核挂钩权。</w:t>
+        <w:t>深化设计滞后或不深 → 采购节奏乱/供应商质量不稳 → 质检与物资信息不对称 → 发货与现场脱节 → 赶工返工、劳务波动 → 口碑与成本双损。</w:t>
       </w:r>
     </w:p>
     <w:p>
-      <w:pPr>
-        <w:pStyle w:val="ListBullet"/>
-      </w:pPr>
       <w:r>
-        <w:t>强制动作：启动交底、变更书面纪要、完工复盘。</w:t>
+        <w:t>会上请拍板：</w:t>
       </w:r>
     </w:p>
     <w:p>
-      <w:pPr>
-        <w:pStyle w:val="ListBullet"/>
-      </w:pPr>
       <w:r>
-        <w:t>质量闸门：供应商分级、发货前质检（尤其焊接与细节）能否拦发货。</w:t>
+        <w:t>1. 计划运营是否具备对技术/采购/质检/物流/工程的节点约束与考核挂钩权。</w:t>
       </w:r>
     </w:p>
     <w:p>
-      <w:pPr>
-        <w:pStyle w:val="ListBullet"/>
-      </w:pPr>
       <w:r>
-        <w:t>设计/加工/发货产能触顶后：排产、外协，还是控制接单承诺。</w:t>
+        <w:t>2. 启动交底、变更书面纪要、完工复盘是否强制。</w:t>
       </w:r>
     </w:p>
     <w:p>
-      <w:pPr>
-        <w:pStyle w:val="ListBullet"/>
-      </w:pPr>
       <w:r>
-        <w:t>现场问题先止损复产，再复盘定责；安全与重大质量一票否决。</w:t>
+        <w:t>3. 供应商分级、发货前质检（尤其焊接与细节）能否拦发货。</w:t>
+      </w:r>
+    </w:p>
+    <w:p>
+      <w:r>
+        <w:t>4. 设计/加工/发货产能触顶后：排产、外协，还是控制接单承诺。</w:t>
+      </w:r>
+    </w:p>
+    <w:p>
+      <w:r>
+        <w:t>5. 现场问题先止损复产，再复盘定责。</w:t>
       </w:r>
     </w:p>
     <w:p>
@@ -297,20 +346,17 @@
         <w:pStyle w:val="Heading2"/>
       </w:pPr>
       <w:r>
-        <w:t>议题 4：下半年增长抓手是什么</w:t>
+        <w:t>议题 4：如何做好大项目协作？</w:t>
       </w:r>
     </w:p>
     <w:p>
       <w:r>
-        <w:t>经营本质： 主航道守存量与基本盘；年中会还要明确“多出来的增长从哪来”，避免平均用力。</w:t>
+        <w:t>调研在问什么： 打单与执行交叉中，重点/大型项目如何集中资源、避免“人人都说自己的项目是好项目”。</w:t>
       </w:r>
     </w:p>
     <w:p>
       <w:r>
-        <w:rPr>
-          <w:b/>
-        </w:rPr>
-        <w:t>建议讨论（三选一为主，勿全开）：</w:t>
+        <w:t>问题画像：</w:t>
       </w:r>
     </w:p>
     <w:p>
@@ -318,7 +364,7 @@
         <w:pStyle w:val="ListBullet"/>
       </w:pPr>
       <w:r>
-        <w:t>A. **存量服务**：旧仓改造、备件、运维、智能化升级（毛利稳、粘性强）。</w:t>
+        <w:t>缺少清晰的“大项目/战略项目”认定标准，资源平均用力</w:t>
       </w:r>
     </w:p>
     <w:p>
@@ -326,7 +372,7 @@
         <w:pStyle w:val="ListBullet"/>
       </w:pPr>
       <w:r>
-        <w:t>B. **市场精耕**：2–3 个重点国别/行业深开发 + 公海二次激活。</w:t>
+        <w:t>业务—技术—成本“铁三角”喊得多、机制少；技术赋能业务不足</w:t>
       </w:r>
     </w:p>
     <w:p>
@@ -334,17 +380,45 @@
         <w:pStyle w:val="ListBullet"/>
       </w:pPr>
       <w:r>
-        <w:t>C. **产品标签**：选定 1 个可形成差异化的拳头能力/产品（须有样品或可售卖模块时间表）。</w:t>
+        <w:t>大项目变更多、现场权限不清，跨部门扯皮后置到施工末端</w:t>
+      </w:r>
+    </w:p>
+    <w:p>
+      <w:pPr>
+        <w:pStyle w:val="ListBullet"/>
+      </w:pPr>
+      <w:r>
+        <w:t>前端合同谈判未给深化/采购留工期余量，大项目更容易爆雷</w:t>
       </w:r>
     </w:p>
     <w:p>
       <w:r>
-        <w:t>同步明确：品牌素材与标杆案例是否纳入重点项目强制动作，服务获客闭环。</w:t>
+        <w:t>会上请拍板：</w:t>
       </w:r>
     </w:p>
     <w:p>
       <w:r>
-        <w:t>会后产物： 《下半年增长抓手一页纸》（目标、投入、责任人、退出条件）</w:t>
+        <w:t>1. 大项目定义：金额、战略客户、复杂度、国别等标准（谁认定、多久认定一次）。</w:t>
+      </w:r>
+    </w:p>
+    <w:p>
+      <w:r>
+        <w:t>2. 协作机制：是否成立铁三角/项目专班；例会节奏；信息共享平台要求。</w:t>
+      </w:r>
+    </w:p>
+    <w:p>
+      <w:r>
+        <w:t>3. 授权边界：现场紧急处置权限；变更书面闭环谁签字。</w:t>
+      </w:r>
+    </w:p>
+    <w:p>
+      <w:r>
+        <w:t>4. 资源锁定：大项目是否优先锁定技术骨干、采购与施工窗口，禁止被一般询盘挤占。</w:t>
+      </w:r>
+    </w:p>
+    <w:p>
+      <w:r>
+        <w:t>会后产物： 《大项目协作机制》（定义 + 组织 + 授权 + 资源锁定）</w:t>
       </w:r>
     </w:p>
     <w:p>
@@ -357,55 +431,81 @@
         <w:pStyle w:val="Heading2"/>
       </w:pPr>
       <w:r>
-        <w:t>议题 5：经营提效抓哪两件事</w:t>
+        <w:t>议题 5：如何提升跨部门协同效率？</w:t>
       </w:r>
     </w:p>
     <w:p>
       <w:r>
-        <w:t>经营本质： 提效不能摊成“全面数字化”；年中只定两件能服务打单与交付的提效工程。</w:t>
+        <w:t>调研在问什么： 跨部门协同是全卷最高频组织议题之一（约 45%）；效率题中信息差、会议低效、权责不清反复出现。</w:t>
       </w:r>
     </w:p>
     <w:p>
       <w:r>
-        <w:rPr>
-          <w:b/>
-        </w:rPr>
-        <w:t>建议讨论：</w:t>
+        <w:t>问题画像：</w:t>
+      </w:r>
+    </w:p>
+    <w:p>
+      <w:pPr>
+        <w:pStyle w:val="ListBullet"/>
+      </w:pPr>
+      <w:r>
+        <w:t>部门内部氛围尚可，公司跨部门紧张、推诿、各自为战</w:t>
+      </w:r>
+    </w:p>
+    <w:p>
+      <w:pPr>
+        <w:pStyle w:val="ListBullet"/>
+      </w:pPr>
+      <w:r>
+        <w:t>会议长、易变“告状会”；真正打磨少</w:t>
+      </w:r>
+    </w:p>
+    <w:p>
+      <w:pPr>
+        <w:pStyle w:val="ListBullet"/>
+      </w:pPr>
+      <w:r>
+        <w:t>典型断点：提资、返资/说明书、质检—物资信息、发货—现场节奏、合同多头归档等</w:t>
       </w:r>
     </w:p>
     <w:p>
       <w:r>
-        <w:t>1. AI / 知识库试点：优先场景建议锁定 2–3 个（如技术知识库+多语、标书/翻译、公海/商机调研）；原则：账号培训 + 人工终审 + 商业秘密不上公网。责任可归口品牌运营部协同数字化与各部门。</w:t>
+        <w:t>会上请拍板（只选 2–3 条先打通，勿摊大饼）：</w:t>
       </w:r>
     </w:p>
     <w:p>
       <w:r>
-        <w:t>2. 跨部门关键接口：从调研断点中只选 2–3 条先打通，例如：</w:t>
+        <w:t>1. 业务提资前置 ↔ 技术退回</w:t>
       </w:r>
     </w:p>
     <w:p>
       <w:r>
-        <w:t xml:space="preserve">   - 业务提资前置 ↔ 技术退回机制</w:t>
+        <w:t>2. 技术提资 ↔ 物流证书/包装 ↔ 成本招采</w:t>
       </w:r>
     </w:p>
     <w:p>
       <w:r>
-        <w:t xml:space="preserve">   - 技术提资 ↔ 物流证书/包装 ↔ 成本招采</w:t>
+        <w:t>3. 质检信息 ↔ 物资/发货闸门</w:t>
       </w:r>
     </w:p>
     <w:p>
       <w:r>
-        <w:t xml:space="preserve">   - 质检信息 ↔ 物资/发货闸门</w:t>
+        <w:t>4. 计划运营节点 ↔ 各部门考核</w:t>
       </w:r>
     </w:p>
     <w:p>
       <w:r>
-        <w:t xml:space="preserve">   - 计划运营节点 ↔ 各部门考核</w:t>
+        <w:t>5. 成单/丢单/完工复盘 ↔ 经营会固定输入</w:t>
       </w:r>
     </w:p>
     <w:p>
       <w:r>
-        <w:t>会后产物： 《提效试点清单》+《关键接口权责时限表》</w:t>
+        <w:t>每条接口写清：主责、时限、逾期后果。</w:t>
+      </w:r>
+    </w:p>
+    <w:p>
+      <w:r>
+        <w:t>会后产物： 《下半年关键接口权责时限表》</w:t>
       </w:r>
     </w:p>
     <w:p>
@@ -423,32 +523,32 @@
     </w:p>
     <w:p>
       <w:r>
-        <w:t>字段  |  要求</w:t>
+        <w:t>| 字段 | 要求 |</w:t>
       </w:r>
     </w:p>
     <w:p>
       <w:r>
-        <w:t>决议结论  |  一句话（可执行）</w:t>
+        <w:t>| 决议结论 | 一句话（可执行） |</w:t>
       </w:r>
     </w:p>
     <w:p>
       <w:r>
-        <w:t>下半年动作  |  ≤3 条</w:t>
+        <w:t>| 下半年动作 | ≤3 条 |</w:t>
       </w:r>
     </w:p>
     <w:p>
       <w:r>
-        <w:t>责任部门 / 协同  |  主责 1 个，协同列明</w:t>
+        <w:t>| 责任部门 / 协同 | 主责 1 个，协同列明 |</w:t>
       </w:r>
     </w:p>
     <w:p>
       <w:r>
-        <w:t>节点  |  月内可见进展的时间点</w:t>
+        <w:t>| 节点 | 月内可见进展的时间点 |</w:t>
       </w:r>
     </w:p>
     <w:p>
       <w:r>
-        <w:t>暂缓项  |  若暂缓，写明理由与复评时间</w:t>
+        <w:t>| 暂缓项 | 若暂缓，写明理由与复评时间 |</w:t>
       </w:r>
     </w:p>
     <w:p>
@@ -461,27 +561,47 @@
         <w:pStyle w:val="Heading1"/>
       </w:pPr>
       <w:r>
-        <w:t>不纳入本阶段“经营五题”但须同步处理的事项</w:t>
+        <w:t>与调研题目的对照关系</w:t>
       </w:r>
     </w:p>
     <w:p>
       <w:r>
-        <w:t>事项  |  建议处理方式</w:t>
+        <w:t>| 调研原题 | 本阶段是否单列议题 | 说明 |</w:t>
       </w:r>
     </w:p>
     <w:p>
       <w:r>
-        <w:t>调研结果全员通报（采纳/研究中/暂缓）  |  总经办牵头，与第二阶段并行，2 周内完成口径</w:t>
+        <w:t>| Q1 品牌宣传 | 不单列 | 并入议题 1（对外口径/案例资产）及增长动作，不单独占题 |</w:t>
       </w:r>
     </w:p>
     <w:p>
       <w:r>
-        <w:t>双休 / 调休 / 考勤 / 报销简化  |  单列“组织回应专题”，由人力行政 + 财务出试点/暂缓方案，不与经营五题混议</w:t>
+        <w:t>| Q2 产品与赛道 | 并入议题 1 | 与竞争力一并收口“做什么/不做什么” |</w:t>
       </w:r>
     </w:p>
     <w:p>
       <w:r>
-        <w:t>全面自建重资产工厂  |  专项论证，不在年中五题内拍板</w:t>
+        <w:t>| Q3 核心竞争力 | **议题 1** | 直接对应 |</w:t>
+      </w:r>
+    </w:p>
+    <w:p>
+      <w:r>
+        <w:t>| Q4 项目打单 | **议题 2** | 直接对应；大项目协作单列议题 4 |</w:t>
+      </w:r>
+    </w:p>
+    <w:p>
+      <w:r>
+        <w:t>| Q5 项目执行 | **议题 3** | 直接对应 |</w:t>
+      </w:r>
+    </w:p>
+    <w:p>
+      <w:r>
+        <w:t>| Q6 AI应用 | 不单列 | 可作为议题 2/3/5 的提效工具，由品牌运营部协同试点，不占经营五题 |</w:t>
+      </w:r>
+    </w:p>
+    <w:p>
+      <w:r>
+        <w:t>| Q7–Q10 保障/效率/文化/开放题 | 不单列 | 双休/考勤/报销等走组织回应专题 |</w:t>
       </w:r>
     </w:p>
     <w:p>
@@ -499,7 +619,17 @@
     </w:p>
     <w:p>
       <w:r>
-        <w:t>第二阶段建议聚焦五题：①竞争力与主航道收口；②成单率与资源配给；③交付总控与口碑；④下半年增长抓手；⑤AI/知识库试点与关键接口打通。 议透这五题，即可支撑第三阶段各部门下半年经营计划对齐公司方向。</w:t>
+        <w:t>第二阶段建议紧扣调研，聚焦五题：</w:t>
+      </w:r>
+    </w:p>
+    <w:p>
+      <w:r>
+        <w:t>①如何塑造核心竞争力；②怎么提升打单成功率；③怎么提升项目执行效率与交付质量；④如何做好大项目协作；⑤如何提升跨部门协同效率。</w:t>
+      </w:r>
+    </w:p>
+    <w:p>
+      <w:r>
+        <w:t>议透后，第三阶段各部门下半年计划按这五题对齐公司方向。</w:t>
       </w:r>
     </w:p>
     <w:sectPr>

</xml_diff>

<commit_message>
Draft stage-two agenda under Wen's four business dimensions.
Structure topics as product, marketing, operations, competitiveness,
plus org-building items, each with concrete decidable questions.

Co-authored-by: liborvybral-collab <liborvybral-collab@users.noreply.github.com>
</commit_message>
<xml_diff>
--- a/docs/reports/surveys/2026-fy-internal-management/第二阶段经营关键议题.docx
+++ b/docs/reports/surveys/2026-fy-internal-management/第二阶段经营关键议题.docx
@@ -7,41 +7,17 @@
         <w:pStyle w:val="Title"/>
       </w:pPr>
       <w:r>
-        <w:t>2026年中经营分析会 · 第二阶段经营关键议题</w:t>
+        <w:t>《公司调研重大议题讨论会》议题清单</w:t>
       </w:r>
     </w:p>
     <w:p>
       <w:r>
-        <w:t>阶段定位： 内部调研已完成。本阶段议题直接聚焦调研中员工集中提出的经营问题，由管理层专题讨论，形成下半年可执行方向。</w:t>
+        <w:t>会议目的： 基于内部调研，按经营分析框架统一下半年方向；每个议题当场形成决议 / 试点 / 暂缓（须写明理由）。</w:t>
       </w:r>
     </w:p>
     <w:p>
       <w:r>
-        <w:t>议题原则：</w:t>
-      </w:r>
-    </w:p>
-    <w:p>
-      <w:pPr>
-        <w:pStyle w:val="ListBullet"/>
-      </w:pPr>
-      <w:r>
-        <w:t>议题表述对齐调研原题与高频痛点，不另起一套“空战略话术”。</w:t>
-      </w:r>
-    </w:p>
-    <w:p>
-      <w:pPr>
-        <w:pStyle w:val="ListBullet"/>
-      </w:pPr>
-      <w:r>
-        <w:t>数量控制在 **5 个以内**；每个议题当场形成：方向判断 + 责任部门 + 下半年动作。</w:t>
-      </w:r>
-    </w:p>
-    <w:p>
-      <w:pPr>
-        <w:pStyle w:val="ListBullet"/>
-      </w:pPr>
-      <w:r>
-        <w:t>双休/考勤/报销等员工体验问题另作组织回应，不占本阶段经营五题。</w:t>
+        <w:t>讨论规则： 先亮观点、再对方向、最后定责任人与时间；不对着部门互相指责，对准可执行结论。</w:t>
       </w:r>
     </w:p>
     <w:p>
@@ -54,37 +30,52 @@
         <w:pStyle w:val="Heading1"/>
       </w:pPr>
       <w:r>
-        <w:t>建议确定的 5 个关键议题（对齐调研）</w:t>
+        <w:t>一、产品定位</w:t>
       </w:r>
     </w:p>
     <w:p>
       <w:r>
-        <w:t>| 序 | 关键议题（讨论命题） | 对应调研题 | 调研核心信号 | 会上须拍板 |</w:t>
+        <w:t>要解决的问题： 下半年到底主打什么、不做什么，差异化与第二曲线、工厂建设如何定。</w:t>
       </w:r>
     </w:p>
     <w:p>
       <w:r>
-        <w:t>| 1 | **如何塑造公司核心竞争力？** | Q3 核心竞争力；兼及 Q2 赛道 | EPC/系统交付、行业深度、履约口碑、技术差异化说法多但不统一；缺拳头产品焦虑 | 一句话竞争力定义；今明两年各建什么；对外禁止空喊的口径 |</w:t>
+        <w:t>| 序 | 讨论命题（请拍板） | 建议结论形式 |</w:t>
       </w:r>
     </w:p>
     <w:p>
       <w:r>
-        <w:t>| 2 | **怎么提升项目打单成功率？** | Q4 项目打单 | 询盘多成单低；线索分级不足；提资不清耗技术；报价一刀切 | 三级分类与响应规则；提资前置可否退回；分档报价与丢单复盘是否强制 |</w:t>
+        <w:t>| 1.1 | 公司产品如何定义：是“解决方案/系统集成”，还是“解决方案系统 + 核心产品”？核心产品是什么？ | 一句话产品定义 + 核心产品名单（1–3 项） |</w:t>
       </w:r>
     </w:p>
     <w:p>
       <w:r>
-        <w:t>| 3 | **怎么提升项目执行效率与交付质量？** | Q5 项目执行 | 深化—采购—质检—发货—现场断链；供应商/质检 36%；赶工返工损口碑 | 计划运营总控权责；质量闸门；产能触顶规则；交底/变更/复盘强制动作 |</w:t>
+        <w:t>| 1.2 | 产品差异化抓哪几条？对外能讲、对内能交付的差异化是什么？ | 差异化要点 ≤3 条；无能力支撑的口径停用 |</w:t>
       </w:r>
     </w:p>
     <w:p>
       <w:r>
-        <w:t>| 4 | **如何做好大项目协作？** | Q4+Q5 交叉；铁三角/重点项目 | 重点项目资源吃不饱、一般项目拖骨干；业务—技术—成本—工程接口乱 | 大项目定义标准；铁三角/专班机制；例会、提资、变更、现场授权规则 |</w:t>
+        <w:t>| 1.3 | 主航道行业定哪 2–3 个？明确不做什么（负面清单）？ | 主航道名单 + 负面清单 1–3 条 |</w:t>
       </w:r>
     </w:p>
     <w:p>
       <w:r>
-        <w:t>| 5 | **如何提升跨部门协同效率？** | 跨题高频（协同 45%）；Q8 | 信息差、推诿、会议低效、权责不清；个人驱动→体系驱动转不过来 | 下半年先打通的 2–3 条关键接口；权责时限；考核是否挂钩 |</w:t>
+        <w:t>| 1.4 | 第二曲线先验证哪 1 条？（如旧仓改造/运维、工业散料延伸等）投入上限与退出标准是什么？ | 选定 1 条 + 投入/退出标准 |</w:t>
+      </w:r>
+    </w:p>
+    <w:p>
+      <w:r>
+        <w:t>| 1.5 | 工厂建设：全面自建、参股/租赁绑定产能，还是暂缓？若推进，先试点什么品类、何时复评？ | 决议：推进路径 / 试点范围 / 暂缓理由与复评时间 |</w:t>
+      </w:r>
+    </w:p>
+    <w:p>
+      <w:r>
+        <w:t>会后产物： 《产品定位与主航道一页纸》</w:t>
+      </w:r>
+    </w:p>
+    <w:p>
+      <w:r>
+        <w:t>建议主责： 经营层牵头；市场战略、技术/研发、品牌、业务协同</w:t>
       </w:r>
     </w:p>
     <w:p>
@@ -97,415 +88,52 @@
         <w:pStyle w:val="Heading1"/>
       </w:pPr>
       <w:r>
-        <w:t>议题说明（讨论提纲）</w:t>
-      </w:r>
-    </w:p>
-    <w:p>
-      <w:pPr>
-        <w:pStyle w:val="Heading2"/>
-      </w:pPr>
-      <w:r>
-        <w:t>议题 1：如何塑造公司核心竞争力？</w:t>
+        <w:t>二、市场营销</w:t>
       </w:r>
     </w:p>
     <w:p>
       <w:r>
-        <w:t>调研在问什么： 应如何构建公司的核心竞争力？产品与赛道如何定位？</w:t>
+        <w:t>要解决的问题： 打单成功率怎么提上去，品牌与市场机会怎么服务成单。</w:t>
       </w:r>
     </w:p>
     <w:p>
       <w:r>
-        <w:t>员工共识画像（组合竞争力，而非单一产品）：</w:t>
-      </w:r>
-    </w:p>
-    <w:p>
-      <w:pPr>
-        <w:pStyle w:val="ListBullet"/>
-      </w:pPr>
-      <w:r>
-        <w:t>大宗散料智慧储运 **EPC / 系统交付**能力</w:t>
-      </w:r>
-    </w:p>
-    <w:p>
-      <w:pPr>
-        <w:pStyle w:val="ListBullet"/>
-      </w:pPr>
-      <w:r>
-        <w:t>重点行业**工艺与场景深度**（水泥、粮食、港口、矿产等）</w:t>
-      </w:r>
-    </w:p>
-    <w:p>
-      <w:pPr>
-        <w:pStyle w:val="ListBullet"/>
-      </w:pPr>
-      <w:r>
-        <w:t>**履约与交付口碑**（海外圈子小，口碑即获客）</w:t>
-      </w:r>
-    </w:p>
-    <w:p>
-      <w:pPr>
-        <w:pStyle w:val="ListBullet"/>
-      </w:pPr>
-      <w:r>
-        <w:t>**技术研发与差异化**（智能监测、特殊物料等可售卖能力）</w:t>
-      </w:r>
-    </w:p>
-    <w:p>
-      <w:pPr>
-        <w:pStyle w:val="ListBullet"/>
-      </w:pPr>
-      <w:r>
-        <w:t>人才与组织能力</w:t>
+        <w:t>| 序 | 讨论命题（请拍板） | 建议结论形式 |</w:t>
       </w:r>
     </w:p>
     <w:p>
       <w:r>
-        <w:t>尖锐信号： 无拳头产品、参观无样品、过度依赖价格与关系；“什么都能做、什么都不精”。</w:t>
+        <w:t>| 2.1 | 怎么提升项目打单成功率？线索/项目是否强制三级分类（战略/重点/一般）？每级响应深度与时限？ | 《打单分级与响应规则》及上线时间 |</w:t>
       </w:r>
     </w:p>
     <w:p>
       <w:r>
-        <w:t>会上请拍板：</w:t>
+        <w:t>| 2.2 | 提资前置：物料、流程、范围、品牌、决策人等未澄清，技术可否退回？ | 退回机制：是 / 否 + 清单字段 |</w:t>
       </w:r>
     </w:p>
     <w:p>
       <w:r>
-        <w:t>1. 一句话竞争力定义（≤40 字），业务/技术/工程/品牌能共同对外说。</w:t>
+        <w:t>| 2.3 | 报价是否试点高/中/低分档？成单/丢单是否进入月度经营会固定复盘？ | 试点范围 + 复盘责任部门 |</w:t>
       </w:r>
     </w:p>
     <w:p>
       <w:r>
-        <w:t>2. 哪些是“现在就能赢单的”，哪些是“明年要建成的”。</w:t>
+        <w:t>| 2.4 | 品牌运营怎么优化？重点项目是否强制素材采集？展会线索如何闭环沉淀？ | 2–3 条强制动作 + 责任部门（品牌+业务+工程） |</w:t>
       </w:r>
     </w:p>
     <w:p>
       <w:r>
-        <w:t>3. 主航道定 2–3 个行业；明确 1–3 条负面清单（不做什么）；第二曲线只选 1 条验证。</w:t>
+        <w:t>| 2.5 | 市场机会抓哪里？下半年重点国别/行业/公海二次开发怎么排优先级？ | 重点机会清单（≤5）+ 资源配比原则 |</w:t>
       </w:r>
     </w:p>
     <w:p>
       <w:r>
-        <w:t>会后产物： 《核心竞争力定义卡》+《主航道与负面清单一页纸》</w:t>
+        <w:t>会后产物： 《市场营销与打单提效一页纸》</w:t>
       </w:r>
     </w:p>
     <w:p>
       <w:r>
-        <w:t>---</w:t>
-      </w:r>
-    </w:p>
-    <w:p>
-      <w:pPr>
-        <w:pStyle w:val="Heading2"/>
-      </w:pPr>
-      <w:r>
-        <w:t>议题 2：怎么提升项目打单成功率？</w:t>
-      </w:r>
-    </w:p>
-    <w:p>
-      <w:r>
-        <w:t>调研在问什么： 线索分配、客户开发、方案设计、项目报价等，现状问题与可落地方案。</w:t>
-      </w:r>
-    </w:p>
-    <w:p>
-      <w:r>
-        <w:t>问题画像：</w:t>
-      </w:r>
-    </w:p>
-    <w:p>
-      <w:pPr>
-        <w:pStyle w:val="ListBullet"/>
-      </w:pPr>
-      <w:r>
-        <w:t>询盘多、有效商机少；比价型线索消耗技术资源</w:t>
-      </w:r>
-    </w:p>
-    <w:p>
-      <w:pPr>
-        <w:pStyle w:val="ListBullet"/>
-      </w:pPr>
-      <w:r>
-        <w:t>跟进不彻底、渠道单一、公海与线索闭环弱</w:t>
-      </w:r>
-    </w:p>
-    <w:p>
-      <w:pPr>
-        <w:pStyle w:val="ListBullet"/>
-      </w:pPr>
-      <w:r>
-        <w:t>需求未澄清就提技术任务；方案时间被挤、质量不稳</w:t>
-      </w:r>
-    </w:p>
-    <w:p>
-      <w:pPr>
-        <w:pStyle w:val="ListBullet"/>
-      </w:pPr>
-      <w:r>
-        <w:t>报价偏高或一刀切，缺少分档与竞对复盘</w:t>
-      </w:r>
-    </w:p>
-    <w:p>
-      <w:r>
-        <w:t>会上请拍板：</w:t>
-      </w:r>
-    </w:p>
-    <w:p>
-      <w:r>
-        <w:t>1. 线索/项目三级（战略/重点/一般）是否强制执行，每级响应深度与时限。</w:t>
-      </w:r>
-    </w:p>
-    <w:p>
-      <w:r>
-        <w:t>2. 提资前置清单未齐备，技术可否退回。</w:t>
-      </w:r>
-    </w:p>
-    <w:p>
-      <w:r>
-        <w:t>3. 一般线索标准化快响 vs 重点项目吃饱资源。</w:t>
-      </w:r>
-    </w:p>
-    <w:p>
-      <w:r>
-        <w:t>4. 高/中/低分档报价是否试点；成单/丢单是否进入月度经营会固定复盘。</w:t>
-      </w:r>
-    </w:p>
-    <w:p>
-      <w:r>
-        <w:t>会后产物： 《项目筛选与打单响应规则》及上线时间（业务 + 技术 + 成本招采 + 计划运营）</w:t>
-      </w:r>
-    </w:p>
-    <w:p>
-      <w:r>
-        <w:t>---</w:t>
-      </w:r>
-    </w:p>
-    <w:p>
-      <w:pPr>
-        <w:pStyle w:val="Heading2"/>
-      </w:pPr>
-      <w:r>
-        <w:t>议题 3：怎么提升项目执行效率与交付质量？</w:t>
-      </w:r>
-    </w:p>
-    <w:p>
-      <w:r>
-        <w:t>调研在问什么： 深化设计、物资采购、质检、发货、工程施工等，影响交付效率与质量的实际问题。</w:t>
-      </w:r>
-    </w:p>
-    <w:p>
-      <w:r>
-        <w:t>问题链条（高度一致）：</w:t>
-      </w:r>
-    </w:p>
-    <w:p>
-      <w:r>
-        <w:t>深化设计滞后或不深 → 采购节奏乱/供应商质量不稳 → 质检与物资信息不对称 → 发货与现场脱节 → 赶工返工、劳务波动 → 口碑与成本双损。</w:t>
-      </w:r>
-    </w:p>
-    <w:p>
-      <w:r>
-        <w:t>会上请拍板：</w:t>
-      </w:r>
-    </w:p>
-    <w:p>
-      <w:r>
-        <w:t>1. 计划运营是否具备对技术/采购/质检/物流/工程的节点约束与考核挂钩权。</w:t>
-      </w:r>
-    </w:p>
-    <w:p>
-      <w:r>
-        <w:t>2. 启动交底、变更书面纪要、完工复盘是否强制。</w:t>
-      </w:r>
-    </w:p>
-    <w:p>
-      <w:r>
-        <w:t>3. 供应商分级、发货前质检（尤其焊接与细节）能否拦发货。</w:t>
-      </w:r>
-    </w:p>
-    <w:p>
-      <w:r>
-        <w:t>4. 设计/加工/发货产能触顶后：排产、外协，还是控制接单承诺。</w:t>
-      </w:r>
-    </w:p>
-    <w:p>
-      <w:r>
-        <w:t>5. 现场问题先止损复产，再复盘定责。</w:t>
-      </w:r>
-    </w:p>
-    <w:p>
-      <w:r>
-        <w:t>会后产物： 《项目执行总控与质量闸门规则》</w:t>
-      </w:r>
-    </w:p>
-    <w:p>
-      <w:r>
-        <w:t>---</w:t>
-      </w:r>
-    </w:p>
-    <w:p>
-      <w:pPr>
-        <w:pStyle w:val="Heading2"/>
-      </w:pPr>
-      <w:r>
-        <w:t>议题 4：如何做好大项目协作？</w:t>
-      </w:r>
-    </w:p>
-    <w:p>
-      <w:r>
-        <w:t>调研在问什么： 打单与执行交叉中，重点/大型项目如何集中资源、避免“人人都说自己的项目是好项目”。</w:t>
-      </w:r>
-    </w:p>
-    <w:p>
-      <w:r>
-        <w:t>问题画像：</w:t>
-      </w:r>
-    </w:p>
-    <w:p>
-      <w:pPr>
-        <w:pStyle w:val="ListBullet"/>
-      </w:pPr>
-      <w:r>
-        <w:t>缺少清晰的“大项目/战略项目”认定标准，资源平均用力</w:t>
-      </w:r>
-    </w:p>
-    <w:p>
-      <w:pPr>
-        <w:pStyle w:val="ListBullet"/>
-      </w:pPr>
-      <w:r>
-        <w:t>业务—技术—成本“铁三角”喊得多、机制少；技术赋能业务不足</w:t>
-      </w:r>
-    </w:p>
-    <w:p>
-      <w:pPr>
-        <w:pStyle w:val="ListBullet"/>
-      </w:pPr>
-      <w:r>
-        <w:t>大项目变更多、现场权限不清，跨部门扯皮后置到施工末端</w:t>
-      </w:r>
-    </w:p>
-    <w:p>
-      <w:pPr>
-        <w:pStyle w:val="ListBullet"/>
-      </w:pPr>
-      <w:r>
-        <w:t>前端合同谈判未给深化/采购留工期余量，大项目更容易爆雷</w:t>
-      </w:r>
-    </w:p>
-    <w:p>
-      <w:r>
-        <w:t>会上请拍板：</w:t>
-      </w:r>
-    </w:p>
-    <w:p>
-      <w:r>
-        <w:t>1. 大项目定义：金额、战略客户、复杂度、国别等标准（谁认定、多久认定一次）。</w:t>
-      </w:r>
-    </w:p>
-    <w:p>
-      <w:r>
-        <w:t>2. 协作机制：是否成立铁三角/项目专班；例会节奏；信息共享平台要求。</w:t>
-      </w:r>
-    </w:p>
-    <w:p>
-      <w:r>
-        <w:t>3. 授权边界：现场紧急处置权限；变更书面闭环谁签字。</w:t>
-      </w:r>
-    </w:p>
-    <w:p>
-      <w:r>
-        <w:t>4. 资源锁定：大项目是否优先锁定技术骨干、采购与施工窗口，禁止被一般询盘挤占。</w:t>
-      </w:r>
-    </w:p>
-    <w:p>
-      <w:r>
-        <w:t>会后产物： 《大项目协作机制》（定义 + 组织 + 授权 + 资源锁定）</w:t>
-      </w:r>
-    </w:p>
-    <w:p>
-      <w:r>
-        <w:t>---</w:t>
-      </w:r>
-    </w:p>
-    <w:p>
-      <w:pPr>
-        <w:pStyle w:val="Heading2"/>
-      </w:pPr>
-      <w:r>
-        <w:t>议题 5：如何提升跨部门协同效率？</w:t>
-      </w:r>
-    </w:p>
-    <w:p>
-      <w:r>
-        <w:t>调研在问什么： 跨部门协同是全卷最高频组织议题之一（约 45%）；效率题中信息差、会议低效、权责不清反复出现。</w:t>
-      </w:r>
-    </w:p>
-    <w:p>
-      <w:r>
-        <w:t>问题画像：</w:t>
-      </w:r>
-    </w:p>
-    <w:p>
-      <w:pPr>
-        <w:pStyle w:val="ListBullet"/>
-      </w:pPr>
-      <w:r>
-        <w:t>部门内部氛围尚可，公司跨部门紧张、推诿、各自为战</w:t>
-      </w:r>
-    </w:p>
-    <w:p>
-      <w:pPr>
-        <w:pStyle w:val="ListBullet"/>
-      </w:pPr>
-      <w:r>
-        <w:t>会议长、易变“告状会”；真正打磨少</w:t>
-      </w:r>
-    </w:p>
-    <w:p>
-      <w:pPr>
-        <w:pStyle w:val="ListBullet"/>
-      </w:pPr>
-      <w:r>
-        <w:t>典型断点：提资、返资/说明书、质检—物资信息、发货—现场节奏、合同多头归档等</w:t>
-      </w:r>
-    </w:p>
-    <w:p>
-      <w:r>
-        <w:t>会上请拍板（只选 2–3 条先打通，勿摊大饼）：</w:t>
-      </w:r>
-    </w:p>
-    <w:p>
-      <w:r>
-        <w:t>1. 业务提资前置 ↔ 技术退回</w:t>
-      </w:r>
-    </w:p>
-    <w:p>
-      <w:r>
-        <w:t>2. 技术提资 ↔ 物流证书/包装 ↔ 成本招采</w:t>
-      </w:r>
-    </w:p>
-    <w:p>
-      <w:r>
-        <w:t>3. 质检信息 ↔ 物资/发货闸门</w:t>
-      </w:r>
-    </w:p>
-    <w:p>
-      <w:r>
-        <w:t>4. 计划运营节点 ↔ 各部门考核</w:t>
-      </w:r>
-    </w:p>
-    <w:p>
-      <w:r>
-        <w:t>5. 成单/丢单/完工复盘 ↔ 经营会固定输入</w:t>
-      </w:r>
-    </w:p>
-    <w:p>
-      <w:r>
-        <w:t>每条接口写清：主责、时限、逾期后果。</w:t>
-      </w:r>
-    </w:p>
-    <w:p>
-      <w:r>
-        <w:t>会后产物： 《下半年关键接口权责时限表》</w:t>
+        <w:t>建议主责： 业务部牵头；品牌运营、市场战略、客户管理、技术、成本招采协同</w:t>
       </w:r>
     </w:p>
     <w:p>
@@ -518,37 +146,52 @@
         <w:pStyle w:val="Heading1"/>
       </w:pPr>
       <w:r>
-        <w:t>建议的会议产出格式（每个议题统一）</w:t>
+        <w:t>三、经营管理</w:t>
       </w:r>
     </w:p>
     <w:p>
       <w:r>
-        <w:t>| 字段 | 要求 |</w:t>
+        <w:t>要解决的问题： 项目执行效率、部门协同、标准化流程，以及大项目怎么协同作战。</w:t>
       </w:r>
     </w:p>
     <w:p>
       <w:r>
-        <w:t>| 决议结论 | 一句话（可执行） |</w:t>
+        <w:t>| 序 | 讨论命题（请拍板） | 建议结论形式 |</w:t>
       </w:r>
     </w:p>
     <w:p>
       <w:r>
-        <w:t>| 下半年动作 | ≤3 条 |</w:t>
+        <w:t>| 3.1 | 怎么提升项目执行效率？计划运营总控是否对技术/采购/质检/物流/工程具约束力并挂钩考核？ | 总控权责边界 + 考核挂钩方式 |</w:t>
       </w:r>
     </w:p>
     <w:p>
       <w:r>
-        <w:t>| 责任部门 / 协同 | 主责 1 个，协同列明 |</w:t>
+        <w:t>| 3.2 | 质量与交付闸门：供应商分级、发货前质检能否拦发货？产能触顶后排产、外协还是控制接单承诺？ | 闸门规则 + 产能触顶规则 |</w:t>
       </w:r>
     </w:p>
     <w:p>
       <w:r>
-        <w:t>| 节点 | 月内可见进展的时间点 |</w:t>
+        <w:t>| 3.3 | 如何做好大项目协作？大项目认定标准是什么？是否实行铁三角/专班？资源如何锁定？ | 《大项目协作机制》 |</w:t>
       </w:r>
     </w:p>
     <w:p>
       <w:r>
-        <w:t>| 暂缓项 | 若暂缓，写明理由与复评时间 |</w:t>
+        <w:t>| 3.4 | 如何做好跨部门协同？下半年先打通哪 2–3 条关键接口？（如：提资前置↔技术退回；提资↔物流证书包装↔招采；质检↔发货闸门；节点↔考核） | 接口清单 + 主责/时限/逾期后果 |</w:t>
+      </w:r>
+    </w:p>
+    <w:p>
+      <w:r>
+        <w:t>| 3.5 | 标准化流程先梳理哪几条？（建议不超过 3 条，如：提资、变更、完工复盘） | 流程清单 + 责任部门 + 完成节点 |</w:t>
+      </w:r>
+    </w:p>
+    <w:p>
+      <w:r>
+        <w:t>会后产物： 《经营管理与执行总控一页纸》+《关键接口权责时限表》</w:t>
+      </w:r>
+    </w:p>
+    <w:p>
+      <w:r>
+        <w:t>建议主责： 计划运营部牵头；技术、成本招采、质监、物流、工程、业务协同</w:t>
       </w:r>
     </w:p>
     <w:p>
@@ -561,47 +204,47 @@
         <w:pStyle w:val="Heading1"/>
       </w:pPr>
       <w:r>
-        <w:t>与调研题目的对照关系</w:t>
+        <w:t>四、核心竞争力打造</w:t>
       </w:r>
     </w:p>
     <w:p>
       <w:r>
-        <w:t>| 调研原题 | 本阶段是否单列议题 | 说明 |</w:t>
+        <w:t>要解决的问题： 竞争态势怎么看，实荣相对强弱在哪，下半年凭什么赢。</w:t>
       </w:r>
     </w:p>
     <w:p>
       <w:r>
-        <w:t>| Q1 品牌宣传 | 不单列 | 并入议题 1（对外口径/案例资产）及增长动作，不单独占题 |</w:t>
+        <w:t>| 序 | 讨论命题（请拍板） | 建议结论形式 |</w:t>
       </w:r>
     </w:p>
     <w:p>
       <w:r>
-        <w:t>| Q2 产品与赛道 | 并入议题 1 | 与竞争力一并收口“做什么/不做什么” |</w:t>
+        <w:t>| 4.1 | 竞争态势研判：主要对手是谁？我们赢单/丢单的常见原因是什么？ | 对手名单 + 赢/丢单原因 Top3 |</w:t>
       </w:r>
     </w:p>
     <w:p>
       <w:r>
-        <w:t>| Q3 核心竞争力 | **议题 1** | 直接对应 |</w:t>
+        <w:t>| 4.2 | 实荣 SWOT：优势、劣势、机会、威胁各写清 3 条以内（要能指导下半年动作，不做完整学术 SWOT） | SWOT 简表（每格 ≤3 条） |</w:t>
       </w:r>
     </w:p>
     <w:p>
       <w:r>
-        <w:t>| Q4 项目打单 | **议题 2** | 直接对应；大项目协作单列议题 4 |</w:t>
+        <w:t>| 4.3 | 如何塑造自身核心竞争力？对外一句话竞争力定哪句？今明两年各优先加固哪 1–2 项能力？ | 竞争力定义卡 + 加固动作清单 |</w:t>
       </w:r>
     </w:p>
     <w:p>
       <w:r>
-        <w:t>| Q5 项目执行 | **议题 3** | 直接对应 |</w:t>
+        <w:t>说明： 本板块与“产品定位”分工——产品定位定“做什么”；本板块定“凭什么赢、相对对手强在哪”。</w:t>
       </w:r>
     </w:p>
     <w:p>
       <w:r>
-        <w:t>| Q6 AI应用 | 不单列 | 可作为议题 2/3/5 的提效工具，由品牌运营部协同试点，不占经营五题 |</w:t>
+        <w:t>会后产物： 《核心竞争力定义卡》+ SWOT 简表 + 加固动作（责任/里程碑）</w:t>
       </w:r>
     </w:p>
     <w:p>
       <w:r>
-        <w:t>| Q7–Q10 保障/效率/文化/开放题 | 不单列 | 双休/考勤/报销等走组织回应专题 |</w:t>
+        <w:t>建议主责： 经营层牵头；市场战略、业务、技术、工程、品牌协同</w:t>
       </w:r>
     </w:p>
     <w:p>
@@ -614,22 +257,93 @@
         <w:pStyle w:val="Heading1"/>
       </w:pPr>
       <w:r>
-        <w:t>一句话推荐口径（可用于通知管理层）</w:t>
+        <w:t>五、其他议题（组织建设）</w:t>
       </w:r>
     </w:p>
     <w:p>
       <w:r>
-        <w:t>第二阶段建议紧扣调研，聚焦五题：</w:t>
+        <w:t>| 序 | 讨论命题（请拍板） | 建议结论形式 |</w:t>
       </w:r>
     </w:p>
     <w:p>
       <w:r>
-        <w:t>①如何塑造核心竞争力；②怎么提升打单成功率；③怎么提升项目执行效率与交付质量；④如何做好大项目协作；⑤如何提升跨部门协同效率。</w:t>
+        <w:t>| 5.1 | 考勤 / 调休 / 双休制度应该怎么调整？是否试点、试点范围、规则与时间表？若暂缓，理由与复评时间？ | 调整方案 / 试点方案 / 暂缓说明 |</w:t>
       </w:r>
     </w:p>
     <w:p>
       <w:r>
-        <w:t>议透后，第三阶段各部门下半年计划按这五题对齐公司方向。</w:t>
+        <w:t>会后产物： 《考勤调休双休调整意见》及通报口径</w:t>
+      </w:r>
+    </w:p>
+    <w:p>
+      <w:r>
+        <w:t>建议主责： 人力行政部牵头；总经办协同</w:t>
+      </w:r>
+    </w:p>
+    <w:p>
+      <w:r>
+        <w:t>---</w:t>
+      </w:r>
+    </w:p>
+    <w:p>
+      <w:pPr>
+        <w:pStyle w:val="Heading1"/>
+      </w:pPr>
+      <w:r>
+        <w:t>建议会议节奏（供参考）</w:t>
+      </w:r>
+    </w:p>
+    <w:p>
+      <w:r>
+        <w:t>| 板块 | 建议时长 | 必须带走的结论 |</w:t>
+      </w:r>
+    </w:p>
+    <w:p>
+      <w:r>
+        <w:t>| 一、产品定位 | 40 分钟 | 定义 + 主航道/负面清单 + 第二曲线 + 工厂态度 |</w:t>
+      </w:r>
+    </w:p>
+    <w:p>
+      <w:r>
+        <w:t>| 二、市场营销 | 35 分钟 | 打单分级规则 + 品牌强制动作 + 重点机会 |</w:t>
+      </w:r>
+    </w:p>
+    <w:p>
+      <w:r>
+        <w:t>| 三、经营管理 | 40 分钟 | 总控权责 + 大项目机制 + 2–3 条关键接口 |</w:t>
+      </w:r>
+    </w:p>
+    <w:p>
+      <w:r>
+        <w:t>| 四、核心竞争力打造 | 25 分钟 | 一句话竞争力 + SWOT 简表 + 加固动作 |</w:t>
+      </w:r>
+    </w:p>
+    <w:p>
+      <w:r>
+        <w:t>| 五、其他议题 | 15 分钟 | 考勤/调休/双休：调/试点/暂缓 |</w:t>
+      </w:r>
+    </w:p>
+    <w:p>
+      <w:r>
+        <w:t>每个子议题结论统一记四要素：决议结论、责任部门、完成节点、暂缓理由（如有）。</w:t>
+      </w:r>
+    </w:p>
+    <w:p>
+      <w:r>
+        <w:t>---</w:t>
+      </w:r>
+    </w:p>
+    <w:p>
+      <w:pPr>
+        <w:pStyle w:val="Heading1"/>
+      </w:pPr>
+      <w:r>
+        <w:t>一句话通知口径</w:t>
+      </w:r>
+    </w:p>
+    <w:p>
+      <w:r>
+        <w:t>本次议题按温总提出的四个维度组织：产品定位、市场营销、经营管理、核心竞争力打造，另设组织建设其他议题（考勤/调休/双休）。每个维度下设可拍板的具体问题，会前请各部门负责人按本清单提前构思，会上对方向、定责任、定节点。</w:t>
       </w:r>
     </w:p>
     <w:sectPr>

</xml_diff>